<commit_message>
GDD: uusi Toteutustilanne-osio ohjaamaan laajuutta
Sasu: viimeistellään ensin tähänastinen työ (kuvavelka 121/126 puuttuu)
ennen laajentamista. GDD:hen lisätty kolmiluokkainen seuranta:
1. Toteutetut, 2. Toteutusvaiheessa olevat, 3. Tulevat suunnitelmat.
Uudet ideat (esim. audienssin delegaatiokuvat) kirjataan jatkossa
luokkaan 3 sen sijaan että niitä lähdettäisiin toteuttamaan heti.

Päivitetty sekä docx (word/document.xml, XSD-validoitu alkuperäistä
vasten - ei uusia virheitä) että GDD.md samansisältöisenä.

Co-Authored-By: Claude Sonnet 5 <noreply@anthropic.com>
Claude-Session: https://claude.ai/code/session_01FmwAFWVrWey7n767ghmF4x
</commit_message>
<xml_diff>
--- a/docs/Dictator_GDD_V11.docx
+++ b/docs/Dictator_GDD_V11.docx
@@ -167,6 +167,1256 @@
         <w:rPr>
           <w:rtl w:val="0"/>
         </w:rPr>
+      </w:r>
+    </w:p>
+    <w:p>
+      <w:pPr>
+        <w:pStyle w:val="Heading1"/>
+        <w:spacing w:after="120" w:before="240" w:lineRule="auto"/>
+        <w:rPr/>
+      </w:pPr>
+      <w:r>
+        <w:rPr>
+          <w:rFonts w:ascii="Arial Unicode MS" w:cs="Arial Unicode MS" w:eastAsia="Arial Unicode MS" w:hAnsi="Arial Unicode MS"/>
+          <w:b w:val="1"/>
+          <w:bCs w:val="1"/>
+          <w:rtl w:val="0"/>
+        </w:rPr>
+        <w:t xml:space="preserve">Toteutustilanne (elokuu 2026)</w:t>
+      </w:r>
+      <w:r>
+        <w:rPr>
+          <w:rtl w:val="0"/>
+        </w:rPr>
+      </w:r>
+    </w:p>
+    <w:p>
+      <w:pPr>
+        <w:spacing w:after="120" w:lineRule="auto"/>
+        <w:rPr/>
+      </w:pPr>
+      <w:r>
+        <w:rPr>
+          <w:rtl w:val="0"/>
+        </w:rPr>
+        <w:t xml:space="preserve">Tämä osio seuraa TOTEUTUSTA erillään säännöistä, kolmessa luokassa. Periaate (Sasu, elokuu 2026): uusi idea kirjataan aina ensin luokkaan 3 eikä toteuteta suoraan. Kun sen toteutus alkaa, se siirtyy luokkaan 2, ja kun se toimii pelissä testattuna, luokkaan 1.</w:t>
+      </w:r>
+    </w:p>
+    <w:p>
+      <w:pPr>
+        <w:pStyle w:val="Heading2"/>
+        <w:spacing w:after="120" w:before="240" w:lineRule="auto"/>
+        <w:rPr/>
+      </w:pPr>
+      <w:r>
+        <w:rPr>
+          <w:rFonts w:ascii="Arial" w:cs="Arial" w:eastAsia="Arial" w:hAnsi="Arial"/>
+          <w:b w:val="1"/>
+          <w:bCs w:val="1"/>
+          <w:rtl w:val="0"/>
+        </w:rPr>
+        <w:t xml:space="preserve">1. Toteutetut</w:t>
+      </w:r>
+      <w:r>
+        <w:rPr>
+          <w:rtl w:val="0"/>
+        </w:rPr>
+      </w:r>
+    </w:p>
+    <w:p>
+      <w:pPr>
+        <w:spacing w:after="120" w:lineRule="auto"/>
+        <w:rPr/>
+      </w:pPr>
+      <w:r>
+        <w:rPr>
+          <w:rtl w:val="0"/>
+        </w:rPr>
+        <w:t xml:space="preserve">GDD:n mukaiset osiot pelillisesti valmiina selaimessa:</w:t>
+      </w:r>
+    </w:p>
+    <w:p>
+      <w:pPr>
+        <w:keepNext w:val="0"/>
+        <w:keepLines w:val="0"/>
+        <w:pageBreakBefore w:val="0"/>
+        <w:widowControl w:val="1"/>
+        <w:numPr>
+          <w:ilvl w:val="0"/>
+          <w:numId w:val="1"/>
+        </w:numPr>
+        <w:pBdr>
+          <w:top w:space="0" w:sz="0" w:val="nil"/>
+          <w:left w:space="0" w:sz="0" w:val="nil"/>
+          <w:bottom w:space="0" w:sz="0" w:val="nil"/>
+          <w:right w:space="0" w:sz="0" w:val="nil"/>
+          <w:between w:space="0" w:sz="0" w:val="nil"/>
+        </w:pBdr>
+        <w:shd w:fill="auto" w:val="clear"/>
+        <w:spacing w:after="0" w:before="0" w:line="240" w:lineRule="auto"/>
+        <w:ind w:left="720" w:right="0" w:hanging="360"/>
+        <w:jc w:val="left"/>
+        <w:rPr/>
+      </w:pPr>
+      <w:r>
+        <w:rPr>
+          <w:rFonts w:ascii="Arial" w:cs="Arial" w:eastAsia="Arial" w:hAnsi="Arial"/>
+          <w:b w:val="0"/>
+          <w:bCs w:val="0"/>
+          <w:i w:val="0"/>
+          <w:iCs w:val="0"/>
+          <w:smallCaps w:val="0"/>
+          <w:strike w:val="0"/>
+          <w:color w:val="000000"/>
+          <w:sz w:val="22"/>
+          <w:szCs w:val="22"/>
+          <w:u w:val="none"/>
+          <w:shd w:fill="auto" w:val="clear"/>
+          <w:vertAlign w:val="baseline"/>
+          <w:rtl w:val="0"/>
+        </w:rPr>
+        <w:t xml:space="preserve">Runko, kassajärjestelmä, ryhmät ja mittarit (osiot 1–3)</w:t>
+      </w:r>
+    </w:p>
+    <w:p>
+      <w:pPr>
+        <w:keepNext w:val="0"/>
+        <w:keepLines w:val="0"/>
+        <w:pageBreakBefore w:val="0"/>
+        <w:widowControl w:val="1"/>
+        <w:numPr>
+          <w:ilvl w:val="0"/>
+          <w:numId w:val="1"/>
+        </w:numPr>
+        <w:pBdr>
+          <w:top w:space="0" w:sz="0" w:val="nil"/>
+          <w:left w:space="0" w:sz="0" w:val="nil"/>
+          <w:bottom w:space="0" w:sz="0" w:val="nil"/>
+          <w:right w:space="0" w:sz="0" w:val="nil"/>
+          <w:between w:space="0" w:sz="0" w:val="nil"/>
+        </w:pBdr>
+        <w:shd w:fill="auto" w:val="clear"/>
+        <w:spacing w:after="0" w:before="0" w:line="240" w:lineRule="auto"/>
+        <w:ind w:left="720" w:right="0" w:hanging="360"/>
+        <w:jc w:val="left"/>
+        <w:rPr/>
+      </w:pPr>
+      <w:r>
+        <w:rPr>
+          <w:rFonts w:ascii="Arial" w:cs="Arial" w:eastAsia="Arial" w:hAnsi="Arial"/>
+          <w:b w:val="0"/>
+          <w:bCs w:val="0"/>
+          <w:i w:val="0"/>
+          <w:iCs w:val="0"/>
+          <w:smallCaps w:val="0"/>
+          <w:strike w:val="0"/>
+          <w:color w:val="000000"/>
+          <w:sz w:val="22"/>
+          <w:szCs w:val="22"/>
+          <w:u w:val="none"/>
+          <w:shd w:fill="auto" w:val="clear"/>
+          <w:vertAlign w:val="baseline"/>
+          <w:rtl w:val="0"/>
+        </w:rPr>
+        <w:t xml:space="preserve">Audienssijärjestelmä, 42 korttia (osiot 4.1, 5)</w:t>
+      </w:r>
+    </w:p>
+    <w:p>
+      <w:pPr>
+        <w:keepNext w:val="0"/>
+        <w:keepLines w:val="0"/>
+        <w:pageBreakBefore w:val="0"/>
+        <w:widowControl w:val="1"/>
+        <w:numPr>
+          <w:ilvl w:val="0"/>
+          <w:numId w:val="1"/>
+        </w:numPr>
+        <w:pBdr>
+          <w:top w:space="0" w:sz="0" w:val="nil"/>
+          <w:left w:space="0" w:sz="0" w:val="nil"/>
+          <w:bottom w:space="0" w:sz="0" w:val="nil"/>
+          <w:right w:space="0" w:sz="0" w:val="nil"/>
+          <w:between w:space="0" w:sz="0" w:val="nil"/>
+        </w:pBdr>
+        <w:shd w:fill="auto" w:val="clear"/>
+        <w:spacing w:after="0" w:before="0" w:line="240" w:lineRule="auto"/>
+        <w:ind w:left="720" w:right="0" w:hanging="360"/>
+        <w:jc w:val="left"/>
+        <w:rPr/>
+      </w:pPr>
+      <w:r>
+        <w:rPr>
+          <w:rFonts w:ascii="Arial" w:cs="Arial" w:eastAsia="Arial" w:hAnsi="Arial"/>
+          <w:b w:val="0"/>
+          <w:bCs w:val="0"/>
+          <w:i w:val="0"/>
+          <w:iCs w:val="0"/>
+          <w:smallCaps w:val="0"/>
+          <w:strike w:val="0"/>
+          <w:color w:val="000000"/>
+          <w:sz w:val="22"/>
+          <w:szCs w:val="22"/>
+          <w:u w:val="none"/>
+          <w:shd w:fill="auto" w:val="clear"/>
+          <w:vertAlign w:val="baseline"/>
+          <w:rtl w:val="0"/>
+        </w:rPr>
+        <w:t xml:space="preserve">Presidentin päätökset, 19 korttia (osio 6)</w:t>
+      </w:r>
+    </w:p>
+    <w:p>
+      <w:pPr>
+        <w:keepNext w:val="0"/>
+        <w:keepLines w:val="0"/>
+        <w:pageBreakBefore w:val="0"/>
+        <w:widowControl w:val="1"/>
+        <w:numPr>
+          <w:ilvl w:val="0"/>
+          <w:numId w:val="1"/>
+        </w:numPr>
+        <w:pBdr>
+          <w:top w:space="0" w:sz="0" w:val="nil"/>
+          <w:left w:space="0" w:sz="0" w:val="nil"/>
+          <w:bottom w:space="0" w:sz="0" w:val="nil"/>
+          <w:right w:space="0" w:sz="0" w:val="nil"/>
+          <w:between w:space="0" w:sz="0" w:val="nil"/>
+        </w:pBdr>
+        <w:shd w:fill="auto" w:val="clear"/>
+        <w:spacing w:after="0" w:before="0" w:line="240" w:lineRule="auto"/>
+        <w:ind w:left="720" w:right="0" w:hanging="360"/>
+        <w:jc w:val="left"/>
+        <w:rPr/>
+      </w:pPr>
+      <w:r>
+        <w:rPr>
+          <w:rFonts w:ascii="Arial" w:cs="Arial" w:eastAsia="Arial" w:hAnsi="Arial"/>
+          <w:b w:val="0"/>
+          <w:bCs w:val="0"/>
+          <w:i w:val="0"/>
+          <w:iCs w:val="0"/>
+          <w:smallCaps w:val="0"/>
+          <w:strike w:val="0"/>
+          <w:color w:val="000000"/>
+          <w:sz w:val="22"/>
+          <w:szCs w:val="22"/>
+          <w:u w:val="none"/>
+          <w:shd w:fill="auto" w:val="clear"/>
+          <w:vertAlign w:val="baseline"/>
+          <w:rtl w:val="0"/>
+        </w:rPr>
+        <w:t xml:space="preserve">Uutisvaihe, 48 korttia, N1-eskalaatiokierre ja ehdolliset kortit (osiot 4.2, 7)</w:t>
+      </w:r>
+    </w:p>
+    <w:p>
+      <w:pPr>
+        <w:keepNext w:val="0"/>
+        <w:keepLines w:val="0"/>
+        <w:pageBreakBefore w:val="0"/>
+        <w:widowControl w:val="1"/>
+        <w:numPr>
+          <w:ilvl w:val="0"/>
+          <w:numId w:val="1"/>
+        </w:numPr>
+        <w:pBdr>
+          <w:top w:space="0" w:sz="0" w:val="nil"/>
+          <w:left w:space="0" w:sz="0" w:val="nil"/>
+          <w:bottom w:space="0" w:sz="0" w:val="nil"/>
+          <w:right w:space="0" w:sz="0" w:val="nil"/>
+          <w:between w:space="0" w:sz="0" w:val="nil"/>
+        </w:pBdr>
+        <w:shd w:fill="auto" w:val="clear"/>
+        <w:spacing w:after="0" w:before="0" w:line="240" w:lineRule="auto"/>
+        <w:ind w:left="720" w:right="0" w:hanging="360"/>
+        <w:jc w:val="left"/>
+        <w:rPr/>
+      </w:pPr>
+      <w:r>
+        <w:rPr>
+          <w:rFonts w:ascii="Arial" w:cs="Arial" w:eastAsia="Arial" w:hAnsi="Arial"/>
+          <w:b w:val="0"/>
+          <w:bCs w:val="0"/>
+          <w:i w:val="0"/>
+          <w:iCs w:val="0"/>
+          <w:smallCaps w:val="0"/>
+          <w:strike w:val="0"/>
+          <w:color w:val="000000"/>
+          <w:sz w:val="22"/>
+          <w:szCs w:val="22"/>
+          <w:u w:val="none"/>
+          <w:shd w:fill="auto" w:val="clear"/>
+          <w:vertAlign w:val="baseline"/>
+          <w:rtl w:val="0"/>
+        </w:rPr>
+        <w:t xml:space="preserve">Sota: pikasota (A1) ja eskalaatio (P1/D16), sodan ratkaisu, jälkitila ja velkavaihe (osio 8)</w:t>
+      </w:r>
+    </w:p>
+    <w:p>
+      <w:pPr>
+        <w:keepNext w:val="0"/>
+        <w:keepLines w:val="0"/>
+        <w:pageBreakBefore w:val="0"/>
+        <w:widowControl w:val="1"/>
+        <w:numPr>
+          <w:ilvl w:val="0"/>
+          <w:numId w:val="1"/>
+        </w:numPr>
+        <w:pBdr>
+          <w:top w:space="0" w:sz="0" w:val="nil"/>
+          <w:left w:space="0" w:sz="0" w:val="nil"/>
+          <w:bottom w:space="0" w:sz="0" w:val="nil"/>
+          <w:right w:space="0" w:sz="0" w:val="nil"/>
+          <w:between w:space="0" w:sz="0" w:val="nil"/>
+        </w:pBdr>
+        <w:shd w:fill="auto" w:val="clear"/>
+        <w:spacing w:after="0" w:before="0" w:line="240" w:lineRule="auto"/>
+        <w:ind w:left="720" w:right="0" w:hanging="360"/>
+        <w:jc w:val="left"/>
+        <w:rPr/>
+      </w:pPr>
+      <w:r>
+        <w:rPr>
+          <w:rFonts w:ascii="Arial" w:cs="Arial" w:eastAsia="Arial" w:hAnsi="Arial"/>
+          <w:b w:val="0"/>
+          <w:bCs w:val="0"/>
+          <w:i w:val="0"/>
+          <w:iCs w:val="0"/>
+          <w:smallCaps w:val="0"/>
+          <w:strike w:val="0"/>
+          <w:color w:val="000000"/>
+          <w:sz w:val="22"/>
+          <w:szCs w:val="22"/>
+          <w:u w:val="none"/>
+          <w:shd w:fill="auto" w:val="clear"/>
+          <w:vertAlign w:val="baseline"/>
+          <w:rtl w:val="0"/>
+        </w:rPr>
+        <w:t xml:space="preserve">Vallankumous, kaappaus, kapina ja puolustusvalinta (osio 9)</w:t>
+      </w:r>
+    </w:p>
+    <w:p>
+      <w:pPr>
+        <w:keepNext w:val="0"/>
+        <w:keepLines w:val="0"/>
+        <w:pageBreakBefore w:val="0"/>
+        <w:widowControl w:val="1"/>
+        <w:numPr>
+          <w:ilvl w:val="0"/>
+          <w:numId w:val="1"/>
+        </w:numPr>
+        <w:pBdr>
+          <w:top w:space="0" w:sz="0" w:val="nil"/>
+          <w:left w:space="0" w:sz="0" w:val="nil"/>
+          <w:bottom w:space="0" w:sz="0" w:val="nil"/>
+          <w:right w:space="0" w:sz="0" w:val="nil"/>
+          <w:between w:space="0" w:sz="0" w:val="nil"/>
+        </w:pBdr>
+        <w:shd w:fill="auto" w:val="clear"/>
+        <w:spacing w:after="0" w:before="0" w:line="240" w:lineRule="auto"/>
+        <w:ind w:left="720" w:right="0" w:hanging="360"/>
+        <w:jc w:val="left"/>
+        <w:rPr/>
+      </w:pPr>
+      <w:r>
+        <w:rPr>
+          <w:rFonts w:ascii="Arial" w:cs="Arial" w:eastAsia="Arial" w:hAnsi="Arial"/>
+          <w:b w:val="0"/>
+          <w:bCs w:val="0"/>
+          <w:i w:val="0"/>
+          <w:iCs w:val="0"/>
+          <w:smallCaps w:val="0"/>
+          <w:strike w:val="0"/>
+          <w:color w:val="000000"/>
+          <w:sz w:val="22"/>
+          <w:szCs w:val="22"/>
+          <w:u w:val="none"/>
+          <w:shd w:fill="auto" w:val="clear"/>
+          <w:vertAlign w:val="baseline"/>
+          <w:rtl w:val="0"/>
+        </w:rPr>
+        <w:t xml:space="preserve">Attentaatti (osio 10)</w:t>
+      </w:r>
+    </w:p>
+    <w:p>
+      <w:pPr>
+        <w:keepNext w:val="0"/>
+        <w:keepLines w:val="0"/>
+        <w:pageBreakBefore w:val="0"/>
+        <w:widowControl w:val="1"/>
+        <w:numPr>
+          <w:ilvl w:val="0"/>
+          <w:numId w:val="1"/>
+        </w:numPr>
+        <w:pBdr>
+          <w:top w:space="0" w:sz="0" w:val="nil"/>
+          <w:left w:space="0" w:sz="0" w:val="nil"/>
+          <w:bottom w:space="0" w:sz="0" w:val="nil"/>
+          <w:right w:space="0" w:sz="0" w:val="nil"/>
+          <w:between w:space="0" w:sz="0" w:val="nil"/>
+        </w:pBdr>
+        <w:shd w:fill="auto" w:val="clear"/>
+        <w:spacing w:after="0" w:before="0" w:line="240" w:lineRule="auto"/>
+        <w:ind w:left="720" w:right="0" w:hanging="360"/>
+        <w:jc w:val="left"/>
+        <w:rPr/>
+      </w:pPr>
+      <w:r>
+        <w:rPr>
+          <w:rFonts w:ascii="Arial" w:cs="Arial" w:eastAsia="Arial" w:hAnsi="Arial"/>
+          <w:b w:val="0"/>
+          <w:bCs w:val="0"/>
+          <w:i w:val="0"/>
+          <w:iCs w:val="0"/>
+          <w:smallCaps w:val="0"/>
+          <w:strike w:val="0"/>
+          <w:color w:val="000000"/>
+          <w:sz w:val="22"/>
+          <w:szCs w:val="22"/>
+          <w:u w:val="none"/>
+          <w:shd w:fill="auto" w:val="clear"/>
+          <w:vertAlign w:val="baseline"/>
+          <w:rtl w:val="0"/>
+        </w:rPr>
+        <w:t xml:space="preserve">Pako helikopterilla tai vuoristoon, ja pisteytys (osiot 11, 14)</w:t>
+      </w:r>
+    </w:p>
+    <w:p>
+      <w:pPr>
+        <w:keepNext w:val="0"/>
+        <w:keepLines w:val="0"/>
+        <w:pageBreakBefore w:val="0"/>
+        <w:widowControl w:val="1"/>
+        <w:numPr>
+          <w:ilvl w:val="0"/>
+          <w:numId w:val="1"/>
+        </w:numPr>
+        <w:pBdr>
+          <w:top w:space="0" w:sz="0" w:val="nil"/>
+          <w:left w:space="0" w:sz="0" w:val="nil"/>
+          <w:bottom w:space="0" w:sz="0" w:val="nil"/>
+          <w:right w:space="0" w:sz="0" w:val="nil"/>
+          <w:between w:space="0" w:sz="0" w:val="nil"/>
+        </w:pBdr>
+        <w:shd w:fill="auto" w:val="clear"/>
+        <w:spacing w:after="0" w:before="0" w:line="240" w:lineRule="auto"/>
+        <w:ind w:left="720" w:right="0" w:hanging="360"/>
+        <w:jc w:val="left"/>
+        <w:rPr/>
+      </w:pPr>
+      <w:r>
+        <w:rPr>
+          <w:rFonts w:ascii="Arial" w:cs="Arial" w:eastAsia="Arial" w:hAnsi="Arial"/>
+          <w:b w:val="0"/>
+          <w:bCs w:val="0"/>
+          <w:i w:val="0"/>
+          <w:iCs w:val="0"/>
+          <w:smallCaps w:val="0"/>
+          <w:strike w:val="0"/>
+          <w:color w:val="000000"/>
+          <w:sz w:val="22"/>
+          <w:szCs w:val="22"/>
+          <w:u w:val="none"/>
+          <w:shd w:fill="auto" w:val="clear"/>
+          <w:vertAlign w:val="baseline"/>
+          <w:rtl w:val="0"/>
+        </w:rPr>
+        <w:t xml:space="preserve">Poliisiraportti (osio 12)</w:t>
+      </w:r>
+    </w:p>
+    <w:p>
+      <w:pPr>
+        <w:keepNext w:val="0"/>
+        <w:keepLines w:val="0"/>
+        <w:pageBreakBefore w:val="0"/>
+        <w:widowControl w:val="1"/>
+        <w:numPr>
+          <w:ilvl w:val="0"/>
+          <w:numId w:val="1"/>
+        </w:numPr>
+        <w:pBdr>
+          <w:top w:space="0" w:sz="0" w:val="nil"/>
+          <w:left w:space="0" w:sz="0" w:val="nil"/>
+          <w:bottom w:space="0" w:sz="0" w:val="nil"/>
+          <w:right w:space="0" w:sz="0" w:val="nil"/>
+          <w:between w:space="0" w:sz="0" w:val="nil"/>
+        </w:pBdr>
+        <w:shd w:fill="auto" w:val="clear"/>
+        <w:spacing w:after="0" w:before="0" w:line="240" w:lineRule="auto"/>
+        <w:ind w:left="720" w:right="0" w:hanging="360"/>
+        <w:jc w:val="left"/>
+        <w:rPr/>
+      </w:pPr>
+      <w:r>
+        <w:rPr>
+          <w:rFonts w:ascii="Arial" w:cs="Arial" w:eastAsia="Arial" w:hAnsi="Arial"/>
+          <w:b w:val="0"/>
+          <w:bCs w:val="0"/>
+          <w:i w:val="0"/>
+          <w:iCs w:val="0"/>
+          <w:smallCaps w:val="0"/>
+          <w:strike w:val="0"/>
+          <w:color w:val="000000"/>
+          <w:sz w:val="22"/>
+          <w:szCs w:val="22"/>
+          <w:u w:val="none"/>
+          <w:shd w:fill="auto" w:val="clear"/>
+          <w:vertAlign w:val="baseline"/>
+          <w:rtl w:val="0"/>
+        </w:rPr>
+        <w:t xml:space="preserve">Salaisen poliisin kaksiosainen strategia (osio 13)</w:t>
+      </w:r>
+    </w:p>
+    <w:p>
+      <w:pPr>
+        <w:keepNext w:val="0"/>
+        <w:keepLines w:val="0"/>
+        <w:pageBreakBefore w:val="0"/>
+        <w:widowControl w:val="1"/>
+        <w:numPr>
+          <w:ilvl w:val="0"/>
+          <w:numId w:val="1"/>
+        </w:numPr>
+        <w:pBdr>
+          <w:top w:space="0" w:sz="0" w:val="nil"/>
+          <w:left w:space="0" w:sz="0" w:val="nil"/>
+          <w:bottom w:space="0" w:sz="0" w:val="nil"/>
+          <w:right w:space="0" w:sz="0" w:val="nil"/>
+          <w:between w:space="0" w:sz="0" w:val="nil"/>
+        </w:pBdr>
+        <w:shd w:fill="auto" w:val="clear"/>
+        <w:spacing w:after="0" w:before="0" w:line="240" w:lineRule="auto"/>
+        <w:ind w:left="720" w:right="0" w:hanging="360"/>
+        <w:jc w:val="left"/>
+        <w:rPr/>
+      </w:pPr>
+      <w:r>
+        <w:rPr>
+          <w:rFonts w:ascii="Arial" w:cs="Arial" w:eastAsia="Arial" w:hAnsi="Arial"/>
+          <w:b w:val="0"/>
+          <w:bCs w:val="0"/>
+          <w:i w:val="0"/>
+          <w:iCs w:val="0"/>
+          <w:smallCaps w:val="0"/>
+          <w:strike w:val="0"/>
+          <w:color w:val="000000"/>
+          <w:sz w:val="22"/>
+          <w:szCs w:val="22"/>
+          <w:u w:val="none"/>
+          <w:shd w:fill="auto" w:val="clear"/>
+          <w:vertAlign w:val="baseline"/>
+          <w:rtl w:val="0"/>
+        </w:rPr>
+        <w:t xml:space="preserve">Kuukausikierros vaihekoneena (ei enää yksinkertaistettu kierto)</w:t>
+      </w:r>
+    </w:p>
+    <w:p>
+      <w:pPr>
+        <w:keepNext w:val="0"/>
+        <w:keepLines w:val="0"/>
+        <w:pageBreakBefore w:val="0"/>
+        <w:widowControl w:val="1"/>
+        <w:numPr>
+          <w:ilvl w:val="0"/>
+          <w:numId w:val="1"/>
+        </w:numPr>
+        <w:pBdr>
+          <w:top w:space="0" w:sz="0" w:val="nil"/>
+          <w:left w:space="0" w:sz="0" w:val="nil"/>
+          <w:bottom w:space="0" w:sz="0" w:val="nil"/>
+          <w:right w:space="0" w:sz="0" w:val="nil"/>
+          <w:between w:space="0" w:sz="0" w:val="nil"/>
+        </w:pBdr>
+        <w:shd w:fill="auto" w:val="clear"/>
+        <w:spacing w:after="0" w:before="0" w:line="240" w:lineRule="auto"/>
+        <w:ind w:left="720" w:right="0" w:hanging="360"/>
+        <w:jc w:val="left"/>
+        <w:rPr/>
+      </w:pPr>
+      <w:r>
+        <w:rPr>
+          <w:rFonts w:ascii="Arial" w:cs="Arial" w:eastAsia="Arial" w:hAnsi="Arial"/>
+          <w:b w:val="0"/>
+          <w:bCs w:val="0"/>
+          <w:i w:val="0"/>
+          <w:iCs w:val="0"/>
+          <w:smallCaps w:val="0"/>
+          <w:strike w:val="0"/>
+          <w:color w:val="000000"/>
+          <w:sz w:val="22"/>
+          <w:szCs w:val="22"/>
+          <w:u w:val="none"/>
+          <w:shd w:fill="auto" w:val="clear"/>
+          <w:vertAlign w:val="baseline"/>
+          <w:rtl w:val="0"/>
+        </w:rPr>
+        <w:t xml:space="preserve">UI: swipe-audienssit, kosketusystävälliset napit, automaattinen vieritys, mobiilioptimointi</w:t>
+      </w:r>
+    </w:p>
+    <w:p>
+      <w:pPr>
+        <w:keepNext w:val="0"/>
+        <w:keepLines w:val="0"/>
+        <w:pageBreakBefore w:val="0"/>
+        <w:widowControl w:val="1"/>
+        <w:numPr>
+          <w:ilvl w:val="0"/>
+          <w:numId w:val="1"/>
+        </w:numPr>
+        <w:pBdr>
+          <w:top w:space="0" w:sz="0" w:val="nil"/>
+          <w:left w:space="0" w:sz="0" w:val="nil"/>
+          <w:bottom w:space="0" w:sz="0" w:val="nil"/>
+          <w:right w:space="0" w:sz="0" w:val="nil"/>
+          <w:between w:space="0" w:sz="0" w:val="nil"/>
+        </w:pBdr>
+        <w:shd w:fill="auto" w:val="clear"/>
+        <w:spacing w:after="0" w:before="0" w:line="240" w:lineRule="auto"/>
+        <w:ind w:left="720" w:right="0" w:hanging="360"/>
+        <w:jc w:val="left"/>
+        <w:rPr/>
+      </w:pPr>
+      <w:r>
+        <w:rPr>
+          <w:rFonts w:ascii="Arial" w:cs="Arial" w:eastAsia="Arial" w:hAnsi="Arial"/>
+          <w:b w:val="0"/>
+          <w:bCs w:val="0"/>
+          <w:i w:val="0"/>
+          <w:iCs w:val="0"/>
+          <w:smallCaps w:val="0"/>
+          <w:strike w:val="0"/>
+          <w:color w:val="000000"/>
+          <w:sz w:val="22"/>
+          <w:szCs w:val="22"/>
+          <w:u w:val="none"/>
+          <w:shd w:fill="auto" w:val="clear"/>
+          <w:vertAlign w:val="baseline"/>
+          <w:rtl w:val="0"/>
+        </w:rPr>
+        <w:t xml:space="preserve">Julkaisu GitHub Pagesiin, testit ajetaan automaattisesti ennen julkaisua</w:t>
+      </w:r>
+    </w:p>
+    <w:p>
+      <w:pPr>
+        <w:keepNext w:val="0"/>
+        <w:keepLines w:val="0"/>
+        <w:pageBreakBefore w:val="0"/>
+        <w:widowControl w:val="1"/>
+        <w:numPr>
+          <w:ilvl w:val="0"/>
+          <w:numId w:val="1"/>
+        </w:numPr>
+        <w:pBdr>
+          <w:top w:space="0" w:sz="0" w:val="nil"/>
+          <w:left w:space="0" w:sz="0" w:val="nil"/>
+          <w:bottom w:space="0" w:sz="0" w:val="nil"/>
+          <w:right w:space="0" w:sz="0" w:val="nil"/>
+          <w:between w:space="0" w:sz="0" w:val="nil"/>
+        </w:pBdr>
+        <w:shd w:fill="auto" w:val="clear"/>
+        <w:spacing w:after="0" w:before="0" w:line="240" w:lineRule="auto"/>
+        <w:ind w:left="720" w:right="0" w:hanging="360"/>
+        <w:jc w:val="left"/>
+        <w:rPr/>
+      </w:pPr>
+      <w:r>
+        <w:rPr>
+          <w:rFonts w:ascii="Arial" w:cs="Arial" w:eastAsia="Arial" w:hAnsi="Arial"/>
+          <w:b w:val="0"/>
+          <w:bCs w:val="0"/>
+          <w:i w:val="0"/>
+          <w:iCs w:val="0"/>
+          <w:smallCaps w:val="0"/>
+          <w:strike w:val="0"/>
+          <w:color w:val="000000"/>
+          <w:sz w:val="22"/>
+          <w:szCs w:val="22"/>
+          <w:u w:val="none"/>
+          <w:shd w:fill="auto" w:val="clear"/>
+          <w:vertAlign w:val="baseline"/>
+          <w:rtl w:val="0"/>
+        </w:rPr>
+        <w:t xml:space="preserve">Ensimmäiset tapahtumakuvat, 5/126 (A1–A5)</w:t>
+      </w:r>
+    </w:p>
+    <w:p>
+      <w:pPr>
+        <w:spacing w:after="120" w:lineRule="auto"/>
+        <w:rPr/>
+      </w:pPr>
+      <w:r>
+        <w:rPr>
+          <w:rtl w:val="0"/>
+        </w:rPr>
+        <w:t xml:space="preserve">GDD:n ULKOPUOLISET lisäykset jotka toimivat pelissä nyt (ei vielä kirjattu tämän dokumentin numeroituihin osioihin — yksityiskohdat CLAUDE.md:n muistiinpanoissa):</w:t>
+      </w:r>
+    </w:p>
+    <w:p>
+      <w:pPr>
+        <w:keepNext w:val="0"/>
+        <w:keepLines w:val="0"/>
+        <w:pageBreakBefore w:val="0"/>
+        <w:widowControl w:val="1"/>
+        <w:numPr>
+          <w:ilvl w:val="0"/>
+          <w:numId w:val="1"/>
+        </w:numPr>
+        <w:pBdr>
+          <w:top w:space="0" w:sz="0" w:val="nil"/>
+          <w:left w:space="0" w:sz="0" w:val="nil"/>
+          <w:bottom w:space="0" w:sz="0" w:val="nil"/>
+          <w:right w:space="0" w:sz="0" w:val="nil"/>
+          <w:between w:space="0" w:sz="0" w:val="nil"/>
+        </w:pBdr>
+        <w:shd w:fill="auto" w:val="clear"/>
+        <w:spacing w:after="0" w:before="0" w:line="240" w:lineRule="auto"/>
+        <w:ind w:left="720" w:right="0" w:hanging="360"/>
+        <w:jc w:val="left"/>
+        <w:rPr/>
+      </w:pPr>
+      <w:r>
+        <w:rPr>
+          <w:rFonts w:ascii="Arial" w:cs="Arial" w:eastAsia="Arial" w:hAnsi="Arial"/>
+          <w:b w:val="0"/>
+          <w:bCs w:val="0"/>
+          <w:i w:val="0"/>
+          <w:iCs w:val="0"/>
+          <w:smallCaps w:val="0"/>
+          <w:strike w:val="0"/>
+          <w:color w:val="000000"/>
+          <w:sz w:val="22"/>
+          <w:szCs w:val="22"/>
+          <w:u w:val="none"/>
+          <w:shd w:fill="auto" w:val="clear"/>
+          <w:vertAlign w:val="baseline"/>
+          <w:rtl w:val="0"/>
+        </w:rPr>
+        <w:t xml:space="preserve">Audienssikortti on nelisuuntainen: Kyllä/Ei:n lisäksi Ehdota jotain muuta (kortinvaihto kerran per audienssi) ja Menkää pois (skip, −1 suosiota, kortti ei kulu)</w:t>
+      </w:r>
+    </w:p>
+    <w:p>
+      <w:pPr>
+        <w:keepNext w:val="0"/>
+        <w:keepLines w:val="0"/>
+        <w:pageBreakBefore w:val="0"/>
+        <w:widowControl w:val="1"/>
+        <w:numPr>
+          <w:ilvl w:val="0"/>
+          <w:numId w:val="1"/>
+        </w:numPr>
+        <w:pBdr>
+          <w:top w:space="0" w:sz="0" w:val="nil"/>
+          <w:left w:space="0" w:sz="0" w:val="nil"/>
+          <w:bottom w:space="0" w:sz="0" w:val="nil"/>
+          <w:right w:space="0" w:sz="0" w:val="nil"/>
+          <w:between w:space="0" w:sz="0" w:val="nil"/>
+        </w:pBdr>
+        <w:shd w:fill="auto" w:val="clear"/>
+        <w:spacing w:after="0" w:before="0" w:line="240" w:lineRule="auto"/>
+        <w:ind w:left="720" w:right="0" w:hanging="360"/>
+        <w:jc w:val="left"/>
+        <w:rPr/>
+      </w:pPr>
+      <w:r>
+        <w:rPr>
+          <w:rFonts w:ascii="Arial" w:cs="Arial" w:eastAsia="Arial" w:hAnsi="Arial"/>
+          <w:b w:val="0"/>
+          <w:bCs w:val="0"/>
+          <w:i w:val="0"/>
+          <w:iCs w:val="0"/>
+          <w:smallCaps w:val="0"/>
+          <w:strike w:val="0"/>
+          <w:color w:val="000000"/>
+          <w:sz w:val="22"/>
+          <w:szCs w:val="22"/>
+          <w:u w:val="none"/>
+          <w:shd w:fill="auto" w:val="clear"/>
+          <w:vertAlign w:val="baseline"/>
+          <w:rtl w:val="0"/>
+        </w:rPr>
+        <w:t xml:space="preserve">Puolustusvalinnan taistelu on todennäköisyyspohjainen (pelaajan osuus yhteisvoimasta), ei osion 9.6 kirjaimellinen ~25 %</w:t>
+      </w:r>
+    </w:p>
+    <w:p>
+      <w:pPr>
+        <w:keepNext w:val="0"/>
+        <w:keepLines w:val="0"/>
+        <w:pageBreakBefore w:val="0"/>
+        <w:widowControl w:val="1"/>
+        <w:numPr>
+          <w:ilvl w:val="0"/>
+          <w:numId w:val="1"/>
+        </w:numPr>
+        <w:pBdr>
+          <w:top w:space="0" w:sz="0" w:val="nil"/>
+          <w:left w:space="0" w:sz="0" w:val="nil"/>
+          <w:bottom w:space="0" w:sz="0" w:val="nil"/>
+          <w:right w:space="0" w:sz="0" w:val="nil"/>
+          <w:between w:space="0" w:sz="0" w:val="nil"/>
+        </w:pBdr>
+        <w:shd w:fill="auto" w:val="clear"/>
+        <w:spacing w:after="0" w:before="0" w:line="240" w:lineRule="auto"/>
+        <w:ind w:left="720" w:right="0" w:hanging="360"/>
+        <w:jc w:val="left"/>
+        <w:rPr/>
+      </w:pPr>
+      <w:r>
+        <w:rPr>
+          <w:rFonts w:ascii="Arial" w:cs="Arial" w:eastAsia="Arial" w:hAnsi="Arial"/>
+          <w:b w:val="0"/>
+          <w:bCs w:val="0"/>
+          <w:i w:val="0"/>
+          <w:iCs w:val="0"/>
+          <w:smallCaps w:val="0"/>
+          <w:strike w:val="0"/>
+          <w:color w:val="000000"/>
+          <w:sz w:val="22"/>
+          <w:szCs w:val="22"/>
+          <w:u w:val="none"/>
+          <w:shd w:fill="auto" w:val="clear"/>
+          <w:vertAlign w:val="baseline"/>
+          <w:rtl w:val="0"/>
+        </w:rPr>
+        <w:t xml:space="preserve">Vuoristopako on todennäköisyyspohjainen (1 − sissien voima / 9), ei terävä raja</w:t>
+      </w:r>
+    </w:p>
+    <w:p>
+      <w:pPr>
+        <w:keepNext w:val="0"/>
+        <w:keepLines w:val="0"/>
+        <w:pageBreakBefore w:val="0"/>
+        <w:widowControl w:val="1"/>
+        <w:numPr>
+          <w:ilvl w:val="0"/>
+          <w:numId w:val="1"/>
+        </w:numPr>
+        <w:pBdr>
+          <w:top w:space="0" w:sz="0" w:val="nil"/>
+          <w:left w:space="0" w:sz="0" w:val="nil"/>
+          <w:bottom w:space="0" w:sz="0" w:val="nil"/>
+          <w:right w:space="0" w:sz="0" w:val="nil"/>
+          <w:between w:space="0" w:sz="0" w:val="nil"/>
+        </w:pBdr>
+        <w:shd w:fill="auto" w:val="clear"/>
+        <w:spacing w:after="0" w:before="0" w:line="240" w:lineRule="auto"/>
+        <w:ind w:left="720" w:right="0" w:hanging="360"/>
+        <w:jc w:val="left"/>
+        <w:rPr/>
+      </w:pPr>
+      <w:r>
+        <w:rPr>
+          <w:rFonts w:ascii="Arial" w:cs="Arial" w:eastAsia="Arial" w:hAnsi="Arial"/>
+          <w:b w:val="0"/>
+          <w:bCs w:val="0"/>
+          <w:i w:val="0"/>
+          <w:iCs w:val="0"/>
+          <w:smallCaps w:val="0"/>
+          <w:strike w:val="0"/>
+          <w:color w:val="000000"/>
+          <w:sz w:val="22"/>
+          <w:szCs w:val="22"/>
+          <w:u w:val="none"/>
+          <w:shd w:fill="auto" w:val="clear"/>
+          <w:vertAlign w:val="baseline"/>
+          <w:rtl w:val="0"/>
+        </w:rPr>
+        <w:t xml:space="preserve">Sodanjälkeisen REV STR -piikin paluu on nopeutuva-hidastuva, ei lineaarinen</w:t>
+      </w:r>
+    </w:p>
+    <w:p>
+      <w:pPr>
+        <w:keepNext w:val="0"/>
+        <w:keepLines w:val="0"/>
+        <w:pageBreakBefore w:val="0"/>
+        <w:widowControl w:val="1"/>
+        <w:numPr>
+          <w:ilvl w:val="0"/>
+          <w:numId w:val="1"/>
+        </w:numPr>
+        <w:pBdr>
+          <w:top w:space="0" w:sz="0" w:val="nil"/>
+          <w:left w:space="0" w:sz="0" w:val="nil"/>
+          <w:bottom w:space="0" w:sz="0" w:val="nil"/>
+          <w:right w:space="0" w:sz="0" w:val="nil"/>
+          <w:between w:space="0" w:sz="0" w:val="nil"/>
+        </w:pBdr>
+        <w:shd w:fill="auto" w:val="clear"/>
+        <w:spacing w:after="0" w:before="0" w:line="240" w:lineRule="auto"/>
+        <w:ind w:left="720" w:right="0" w:hanging="360"/>
+        <w:jc w:val="left"/>
+        <w:rPr/>
+      </w:pPr>
+      <w:r>
+        <w:rPr>
+          <w:rFonts w:ascii="Arial" w:cs="Arial" w:eastAsia="Arial" w:hAnsi="Arial"/>
+          <w:b w:val="0"/>
+          <w:bCs w:val="0"/>
+          <w:i w:val="0"/>
+          <w:iCs w:val="0"/>
+          <w:smallCaps w:val="0"/>
+          <w:strike w:val="0"/>
+          <w:color w:val="000000"/>
+          <w:sz w:val="22"/>
+          <w:szCs w:val="22"/>
+          <w:u w:val="none"/>
+          <w:shd w:fill="auto" w:val="clear"/>
+          <w:vertAlign w:val="baseline"/>
+          <w:rtl w:val="0"/>
+        </w:rPr>
+        <w:t xml:space="preserve">Poliisiraportti tarjotaan vain kerran kuussa, kuun viimeisenä toimintona — kuukausi on 5-vaiheinen, ei osion 4 kirjaimellinen 8-vaiheinen</w:t>
+      </w:r>
+    </w:p>
+    <w:p>
+      <w:pPr>
+        <w:pStyle w:val="Heading2"/>
+        <w:spacing w:after="120" w:before="240" w:lineRule="auto"/>
+        <w:rPr/>
+      </w:pPr>
+      <w:r>
+        <w:rPr>
+          <w:rFonts w:ascii="Arial" w:cs="Arial" w:eastAsia="Arial" w:hAnsi="Arial"/>
+          <w:b w:val="1"/>
+          <w:bCs w:val="1"/>
+          <w:rtl w:val="0"/>
+        </w:rPr>
+        <w:t xml:space="preserve">2. Toteutusvaiheessa olevat</w:t>
+      </w:r>
+      <w:r>
+        <w:rPr>
+          <w:rtl w:val="0"/>
+        </w:rPr>
+      </w:r>
+    </w:p>
+    <w:p>
+      <w:pPr>
+        <w:keepNext w:val="0"/>
+        <w:keepLines w:val="0"/>
+        <w:pageBreakBefore w:val="0"/>
+        <w:widowControl w:val="1"/>
+        <w:numPr>
+          <w:ilvl w:val="0"/>
+          <w:numId w:val="1"/>
+        </w:numPr>
+        <w:pBdr>
+          <w:top w:space="0" w:sz="0" w:val="nil"/>
+          <w:left w:space="0" w:sz="0" w:val="nil"/>
+          <w:bottom w:space="0" w:sz="0" w:val="nil"/>
+          <w:right w:space="0" w:sz="0" w:val="nil"/>
+          <w:between w:space="0" w:sz="0" w:val="nil"/>
+        </w:pBdr>
+        <w:shd w:fill="auto" w:val="clear"/>
+        <w:spacing w:after="0" w:before="0" w:line="240" w:lineRule="auto"/>
+        <w:ind w:left="720" w:right="0" w:hanging="360"/>
+        <w:jc w:val="left"/>
+        <w:rPr/>
+      </w:pPr>
+      <w:r>
+        <w:rPr>
+          <w:rFonts w:ascii="Arial" w:cs="Arial" w:eastAsia="Arial" w:hAnsi="Arial"/>
+          <w:b w:val="0"/>
+          <w:bCs w:val="0"/>
+          <w:i w:val="0"/>
+          <w:iCs w:val="0"/>
+          <w:smallCaps w:val="0"/>
+          <w:strike w:val="0"/>
+          <w:color w:val="000000"/>
+          <w:sz w:val="22"/>
+          <w:szCs w:val="22"/>
+          <w:u w:val="none"/>
+          <w:shd w:fill="auto" w:val="clear"/>
+          <w:vertAlign w:val="baseline"/>
+          <w:rtl w:val="0"/>
+        </w:rPr>
+        <w:t xml:space="preserve">Tapahtumakuvien tuottaminen Geminillä: 5/126 valmis. Tämä on nyt etusijalla — uusia ominaisuuksia ei aloiteta ennen kuin kuvasto on pidemmällä.</w:t>
+      </w:r>
+    </w:p>
+    <w:p>
+      <w:pPr>
+        <w:keepNext w:val="0"/>
+        <w:keepLines w:val="0"/>
+        <w:pageBreakBefore w:val="0"/>
+        <w:widowControl w:val="1"/>
+        <w:numPr>
+          <w:ilvl w:val="0"/>
+          <w:numId w:val="1"/>
+        </w:numPr>
+        <w:pBdr>
+          <w:top w:space="0" w:sz="0" w:val="nil"/>
+          <w:left w:space="0" w:sz="0" w:val="nil"/>
+          <w:bottom w:space="0" w:sz="0" w:val="nil"/>
+          <w:right w:space="0" w:sz="0" w:val="nil"/>
+          <w:between w:space="0" w:sz="0" w:val="nil"/>
+        </w:pBdr>
+        <w:shd w:fill="auto" w:val="clear"/>
+        <w:spacing w:after="0" w:before="0" w:line="240" w:lineRule="auto"/>
+        <w:ind w:left="720" w:right="0" w:hanging="360"/>
+        <w:jc w:val="left"/>
+        <w:rPr/>
+      </w:pPr>
+      <w:r>
+        <w:rPr>
+          <w:rFonts w:ascii="Arial" w:cs="Arial" w:eastAsia="Arial" w:hAnsi="Arial"/>
+          <w:b w:val="0"/>
+          <w:bCs w:val="0"/>
+          <w:i w:val="0"/>
+          <w:iCs w:val="0"/>
+          <w:smallCaps w:val="0"/>
+          <w:strike w:val="0"/>
+          <w:color w:val="000000"/>
+          <w:sz w:val="22"/>
+          <w:szCs w:val="22"/>
+          <w:u w:val="none"/>
+          <w:shd w:fill="auto" w:val="clear"/>
+          <w:vertAlign w:val="baseline"/>
+          <w:rtl w:val="0"/>
+        </w:rPr>
+        <w:t xml:space="preserve">Pelitestaus jatkuu.</w:t>
+      </w:r>
+    </w:p>
+    <w:p>
+      <w:pPr>
+        <w:pStyle w:val="Heading2"/>
+        <w:spacing w:after="120" w:before="240" w:lineRule="auto"/>
+        <w:rPr/>
+      </w:pPr>
+      <w:r>
+        <w:rPr>
+          <w:rFonts w:ascii="Arial" w:cs="Arial" w:eastAsia="Arial" w:hAnsi="Arial"/>
+          <w:b w:val="1"/>
+          <w:bCs w:val="1"/>
+          <w:rtl w:val="0"/>
+        </w:rPr>
+        <w:t xml:space="preserve">3. Tulevat suunnitelmat</w:t>
+      </w:r>
+      <w:r>
+        <w:rPr>
+          <w:rtl w:val="0"/>
+        </w:rPr>
+      </w:r>
+    </w:p>
+    <w:p>
+      <w:pPr>
+        <w:spacing w:after="120" w:lineRule="auto"/>
+        <w:rPr/>
+      </w:pPr>
+      <w:r>
+        <w:rPr>
+          <w:rtl w:val="0"/>
+        </w:rPr>
+        <w:t xml:space="preserve">Ideoituja, ei aloitettuja. Uusi idea kirjataan tähän eikä toteuteta ennen kuin tämä lista sanoo niin.</w:t>
+      </w:r>
+    </w:p>
+    <w:p>
+      <w:pPr>
+        <w:keepNext w:val="0"/>
+        <w:keepLines w:val="0"/>
+        <w:pageBreakBefore w:val="0"/>
+        <w:widowControl w:val="1"/>
+        <w:numPr>
+          <w:ilvl w:val="0"/>
+          <w:numId w:val="1"/>
+        </w:numPr>
+        <w:pBdr>
+          <w:top w:space="0" w:sz="0" w:val="nil"/>
+          <w:left w:space="0" w:sz="0" w:val="nil"/>
+          <w:bottom w:space="0" w:sz="0" w:val="nil"/>
+          <w:right w:space="0" w:sz="0" w:val="nil"/>
+          <w:between w:space="0" w:sz="0" w:val="nil"/>
+        </w:pBdr>
+        <w:shd w:fill="auto" w:val="clear"/>
+        <w:spacing w:after="0" w:before="0" w:line="240" w:lineRule="auto"/>
+        <w:ind w:left="720" w:right="0" w:hanging="360"/>
+        <w:jc w:val="left"/>
+        <w:rPr/>
+      </w:pPr>
+      <w:r>
+        <w:rPr>
+          <w:rFonts w:ascii="Arial" w:cs="Arial" w:eastAsia="Arial" w:hAnsi="Arial"/>
+          <w:b w:val="0"/>
+          <w:bCs w:val="0"/>
+          <w:i w:val="0"/>
+          <w:iCs w:val="0"/>
+          <w:smallCaps w:val="0"/>
+          <w:strike w:val="0"/>
+          <w:color w:val="000000"/>
+          <w:sz w:val="22"/>
+          <w:szCs w:val="22"/>
+          <w:u w:val="none"/>
+          <w:shd w:fill="auto" w:val="clear"/>
+          <w:vertAlign w:val="baseline"/>
+          <w:rtl w:val="0"/>
+        </w:rPr>
+        <w:t xml:space="preserve">Audienssin delegaatiokuvat: audienssin alussa näytetään delegaation kuva, joka vaihtuu ryhmän suosiotason mukaan (raivostuneesta hymyilevään). Kortin oma kuva siirtyy "paljastukseksi" vasta kun Kyllä/Ei-päätös on tehty. Avoimena: kuinka monta suosioporrasta, näytetäänkö paljastus jokaisen päätöstyypin jälkeen vai vain hyväksynnässä, onko paljastus hetkellinen vai oma jännitysjakso. (Keskusteltu Sasun kanssa elokuu 2026, ei aloitettu — kuvavelka menee edelle.)</w:t>
+      </w:r>
+    </w:p>
+    <w:p>
+      <w:pPr>
+        <w:keepNext w:val="0"/>
+        <w:keepLines w:val="0"/>
+        <w:pageBreakBefore w:val="0"/>
+        <w:widowControl w:val="1"/>
+        <w:numPr>
+          <w:ilvl w:val="0"/>
+          <w:numId w:val="1"/>
+        </w:numPr>
+        <w:pBdr>
+          <w:top w:space="0" w:sz="0" w:val="nil"/>
+          <w:left w:space="0" w:sz="0" w:val="nil"/>
+          <w:bottom w:space="0" w:sz="0" w:val="nil"/>
+          <w:right w:space="0" w:sz="0" w:val="nil"/>
+          <w:between w:space="0" w:sz="0" w:val="nil"/>
+        </w:pBdr>
+        <w:shd w:fill="auto" w:val="clear"/>
+        <w:spacing w:after="0" w:before="0" w:line="240" w:lineRule="auto"/>
+        <w:ind w:left="720" w:right="0" w:hanging="360"/>
+        <w:jc w:val="left"/>
+        <w:rPr/>
+      </w:pPr>
+      <w:r>
+        <w:rPr>
+          <w:rFonts w:ascii="Arial" w:cs="Arial" w:eastAsia="Arial" w:hAnsi="Arial"/>
+          <w:b w:val="0"/>
+          <w:bCs w:val="0"/>
+          <w:i w:val="0"/>
+          <w:iCs w:val="0"/>
+          <w:smallCaps w:val="0"/>
+          <w:strike w:val="0"/>
+          <w:color w:val="000000"/>
+          <w:sz w:val="22"/>
+          <w:szCs w:val="22"/>
+          <w:u w:val="none"/>
+          <w:shd w:fill="auto" w:val="clear"/>
+          <w:vertAlign w:val="baseline"/>
+          <w:rtl w:val="0"/>
+        </w:rPr>
+        <w:t xml:space="preserve">Muita nelisuuntaisen audienssikortin jatkokehitysideoita on mainittu, ei tarkennettu.</w:t>
+      </w:r>
+    </w:p>
+    <w:p>
+      <w:pPr>
+        <w:keepNext w:val="0"/>
+        <w:keepLines w:val="0"/>
+        <w:pageBreakBefore w:val="0"/>
+        <w:widowControl w:val="1"/>
+        <w:numPr>
+          <w:ilvl w:val="0"/>
+          <w:numId w:val="1"/>
+        </w:numPr>
+        <w:pBdr>
+          <w:top w:space="0" w:sz="0" w:val="nil"/>
+          <w:left w:space="0" w:sz="0" w:val="nil"/>
+          <w:bottom w:space="0" w:sz="0" w:val="nil"/>
+          <w:right w:space="0" w:sz="0" w:val="nil"/>
+          <w:between w:space="0" w:sz="0" w:val="nil"/>
+        </w:pBdr>
+        <w:shd w:fill="auto" w:val="clear"/>
+        <w:spacing w:after="0" w:before="0" w:line="240" w:lineRule="auto"/>
+        <w:ind w:left="720" w:right="0" w:hanging="360"/>
+        <w:jc w:val="left"/>
+        <w:rPr/>
+      </w:pPr>
+      <w:r>
+        <w:rPr>
+          <w:rFonts w:ascii="Arial" w:cs="Arial" w:eastAsia="Arial" w:hAnsi="Arial"/>
+          <w:b w:val="0"/>
+          <w:bCs w:val="0"/>
+          <w:i w:val="0"/>
+          <w:iCs w:val="0"/>
+          <w:smallCaps w:val="0"/>
+          <w:strike w:val="0"/>
+          <w:color w:val="000000"/>
+          <w:sz w:val="22"/>
+          <w:szCs w:val="22"/>
+          <w:u w:val="none"/>
+          <w:shd w:fill="auto" w:val="clear"/>
+          <w:vertAlign w:val="baseline"/>
+          <w:rtl w:val="0"/>
+        </w:rPr>
+        <w:t xml:space="preserve">Oikeat äänitiedostot jännitysjaksoihin nykyisten syntetisoitujen äänien tilalle — tekijänoikeuskysymys avoinna.</w:t>
+      </w:r>
+    </w:p>
+    <w:p>
+      <w:pPr>
+        <w:keepNext w:val="0"/>
+        <w:keepLines w:val="0"/>
+        <w:pageBreakBefore w:val="0"/>
+        <w:widowControl w:val="1"/>
+        <w:numPr>
+          <w:ilvl w:val="0"/>
+          <w:numId w:val="1"/>
+        </w:numPr>
+        <w:pBdr>
+          <w:top w:space="0" w:sz="0" w:val="nil"/>
+          <w:left w:space="0" w:sz="0" w:val="nil"/>
+          <w:bottom w:space="0" w:sz="0" w:val="nil"/>
+          <w:right w:space="0" w:sz="0" w:val="nil"/>
+          <w:between w:space="0" w:sz="0" w:val="nil"/>
+        </w:pBdr>
+        <w:shd w:fill="auto" w:val="clear"/>
+        <w:spacing w:after="0" w:before="0" w:line="240" w:lineRule="auto"/>
+        <w:ind w:left="720" w:right="0" w:hanging="360"/>
+        <w:jc w:val="left"/>
+        <w:rPr/>
+      </w:pPr>
+      <w:r>
+        <w:rPr>
+          <w:rFonts w:ascii="Arial" w:cs="Arial" w:eastAsia="Arial" w:hAnsi="Arial"/>
+          <w:b w:val="0"/>
+          <w:bCs w:val="0"/>
+          <w:i w:val="0"/>
+          <w:iCs w:val="0"/>
+          <w:smallCaps w:val="0"/>
+          <w:strike w:val="0"/>
+          <w:color w:val="000000"/>
+          <w:sz w:val="22"/>
+          <w:szCs w:val="22"/>
+          <w:u w:val="none"/>
+          <w:shd w:fill="auto" w:val="clear"/>
+          <w:vertAlign w:val="baseline"/>
+          <w:rtl w:val="0"/>
+        </w:rPr>
+        <w:t xml:space="preserve">Osion 11 täysi pako-VALINTA-ruutu (helikopteri/vuoristo valittavaksi ennen yritystä) — nyt pakoreitti valitaan automaattisesti.</w:t>
+      </w:r>
+    </w:p>
+    <w:p>
+      <w:pPr>
+        <w:keepNext w:val="0"/>
+        <w:keepLines w:val="0"/>
+        <w:pageBreakBefore w:val="0"/>
+        <w:widowControl w:val="1"/>
+        <w:numPr>
+          <w:ilvl w:val="0"/>
+          <w:numId w:val="1"/>
+        </w:numPr>
+        <w:pBdr>
+          <w:top w:space="0" w:sz="0" w:val="nil"/>
+          <w:left w:space="0" w:sz="0" w:val="nil"/>
+          <w:bottom w:space="0" w:sz="0" w:val="nil"/>
+          <w:right w:space="0" w:sz="0" w:val="nil"/>
+          <w:between w:space="0" w:sz="0" w:val="nil"/>
+        </w:pBdr>
+        <w:shd w:fill="auto" w:val="clear"/>
+        <w:spacing w:after="0" w:before="0" w:line="240" w:lineRule="auto"/>
+        <w:ind w:left="720" w:right="0" w:hanging="360"/>
+        <w:jc w:val="left"/>
+        <w:rPr/>
+      </w:pPr>
+      <w:r>
+        <w:rPr>
+          <w:rFonts w:ascii="Arial" w:cs="Arial" w:eastAsia="Arial" w:hAnsi="Arial"/>
+          <w:b w:val="0"/>
+          <w:bCs w:val="0"/>
+          <w:i w:val="0"/>
+          <w:iCs w:val="0"/>
+          <w:smallCaps w:val="0"/>
+          <w:strike w:val="0"/>
+          <w:color w:val="000000"/>
+          <w:sz w:val="22"/>
+          <w:szCs w:val="22"/>
+          <w:u w:val="none"/>
+          <w:shd w:fill="auto" w:val="clear"/>
+          <w:vertAlign w:val="baseline"/>
+          <w:rtl w:val="0"/>
+        </w:rPr>
+        <w:t xml:space="preserve">Kuvien paketointi GitHub Pagesiin lazy-latauksella kun kuvasto lähestyy valmista (~5 Mt).</w:t>
       </w:r>
     </w:p>
     <w:p>

</xml_diff>